<commit_message>
feat(groupe): interconnexion des sociétés d'un même groupe — opérations intragroupe avec écritures miroirs, écritures de l'autre partie dans la société liée, élimination en consolidation ; essai local : compilation du paquet special-ops
Co-Authored-By: Claude Opus 5.5 <noreply@anthropic.com>
Claude-Session: https://claude.ai/code/session_01PES9v2QUtNkt2rhV2e9a8j
</commit_message>
<xml_diff>
--- a/docs/manuels/word/02_MANUEL_D_UTILISATION.docx
+++ b/docs/manuels/word/02_MANUEL_D_UTILISATION.docx
@@ -36,7 +36,7 @@
         </w:p>
       </w:sdtContent>
     </w:sdt>
-    <w:bookmarkStart w:id="58" w:name="jupiter-compta-manuel-dutilisation"/>
+    <w:bookmarkStart w:id="59" w:name="jupiter-compta-manuel-dutilisation"/>
     <w:p>
       <w:pPr>
         <w:pStyle w:val="Heading1"/>
@@ -755,7 +755,7 @@
     </w:p>
     <w:bookmarkEnd w:id="24"/>
     <w:bookmarkEnd w:id="25"/>
-    <w:bookmarkStart w:id="36" w:name="partie-b-comptabilité-générale"/>
+    <w:bookmarkStart w:id="37" w:name="partie-b-comptabilité-générale"/>
     <w:p>
       <w:pPr>
         <w:pStyle w:val="Heading2"/>
@@ -1615,7 +1615,94 @@
       </w:r>
     </w:p>
     <w:bookmarkEnd w:id="34"/>
-    <w:bookmarkStart w:id="35" w:name="b.10-clôture-de-lexercice"/>
+    <w:bookmarkStart w:id="35" w:name="X793f75de194c6f323b3d2d5700384e3ea4358c0"/>
+    <w:p>
+      <w:pPr>
+        <w:pStyle w:val="Heading3"/>
+      </w:pPr>
+      <w:r>
+        <w:t xml:space="preserve">B.9 bis Opérations entre sociétés du groupe</w:t>
+      </w:r>
+    </w:p>
+    <w:p>
+      <w:pPr>
+        <w:pStyle w:val="FirstParagraph"/>
+      </w:pPr>
+      <w:r>
+        <w:t xml:space="preserve">Menu</w:t>
+      </w:r>
+      <w:r>
+        <w:t xml:space="preserve"> </w:t>
+      </w:r>
+      <w:r>
+        <w:rPr>
+          <w:bCs/>
+          <w:b/>
+        </w:rPr>
+        <w:t xml:space="preserve">Opérations spécifiques</w:t>
+      </w:r>
+      <w:r>
+        <w:t xml:space="preserve"> </w:t>
+      </w:r>
+      <w:r>
+        <w:t xml:space="preserve">→</w:t>
+      </w:r>
+      <w:r>
+        <w:t xml:space="preserve"> </w:t>
+      </w:r>
+      <w:r>
+        <w:rPr>
+          <w:bCs/>
+          <w:b/>
+        </w:rPr>
+        <w:t xml:space="preserve">Opération intragroupe</w:t>
+      </w:r>
+      <w:r>
+        <w:t xml:space="preserve"> </w:t>
+      </w:r>
+      <w:r>
+        <w:t xml:space="preserve">: choisissez la société du groupe, la nature (refacturation de prestations, vente de marchandises, prêt, remboursement, intérêts, dividende, règlement), le montant, le taux de TVA du pack pays, la date. Les écritures sont créées en brouillon</w:t>
+      </w:r>
+      <w:r>
+        <w:t xml:space="preserve"> </w:t>
+      </w:r>
+      <w:r>
+        <w:rPr>
+          <w:bCs/>
+          <w:b/>
+        </w:rPr>
+        <w:t xml:space="preserve">dans les deux sociétés</w:t>
+      </w:r>
+      <w:r>
+        <w:t xml:space="preserve"> </w:t>
+      </w:r>
+      <w:r>
+        <w:t xml:space="preserve">avec la même référence</w:t>
+      </w:r>
+      <w:r>
+        <w:t xml:space="preserve"> </w:t>
+      </w:r>
+      <w:r>
+        <w:rPr>
+          <w:rStyle w:val="VerbatimChar"/>
+        </w:rPr>
+        <w:t xml:space="preserve">IG-…</w:t>
+      </w:r>
+      <w:r>
+        <w:t xml:space="preserve"> </w:t>
+      </w:r>
+      <w:r>
+        <w:t xml:space="preserve">; chaque société les valide de son côté. En consolidation, les comptes groupe et les produits et charges réciproques sont éliminés automatiquement.</w:t>
+      </w:r>
+      <w:r>
+        <w:t xml:space="preserve"> </w:t>
+      </w:r>
+      <w:r>
+        <w:t xml:space="preserve">Pour une opération spécifique qui concerne deux sociétés (succursale, société en participation, fusion…), choisissez la société liée dans « Écritures de l’autre partie dans » avant de créer les brouillons.</w:t>
+      </w:r>
+    </w:p>
+    <w:bookmarkEnd w:id="35"/>
+    <w:bookmarkStart w:id="36" w:name="b.10-clôture-de-lexercice"/>
     <w:p>
       <w:pPr>
         <w:pStyle w:val="Heading3"/>
@@ -1736,9 +1823,9 @@
         </w:pict>
       </w:r>
     </w:p>
-    <w:bookmarkEnd w:id="35"/>
     <w:bookmarkEnd w:id="36"/>
-    <w:bookmarkStart w:id="42" w:name="Xb19f9442ab7d684838861f4ae9173b709e3a294"/>
+    <w:bookmarkEnd w:id="37"/>
+    <w:bookmarkStart w:id="43" w:name="Xb19f9442ab7d684838861f4ae9173b709e3a294"/>
     <w:p>
       <w:pPr>
         <w:pStyle w:val="Heading2"/>
@@ -1747,7 +1834,7 @@
         <w:t xml:space="preserve">Partie C — Gestion commerciale, stocks et production</w:t>
       </w:r>
     </w:p>
-    <w:bookmarkStart w:id="37" w:name="c.1-factures-et-documents-commerciaux"/>
+    <w:bookmarkStart w:id="38" w:name="c.1-factures-et-documents-commerciaux"/>
     <w:p>
       <w:pPr>
         <w:pStyle w:val="Heading3"/>
@@ -1841,8 +1928,8 @@
         <w:t xml:space="preserve">de la DGI. L’écriture de vente, la créance client, la TVA collectée et la sortie de stock sont générées automatiquement. Même logique pour les devis, proformas, bons de commande et bons de livraison.</w:t>
       </w:r>
     </w:p>
-    <w:bookmarkEnd w:id="37"/>
-    <w:bookmarkStart w:id="38" w:name="c.2-achats"/>
+    <w:bookmarkEnd w:id="38"/>
+    <w:bookmarkStart w:id="39" w:name="c.2-achats"/>
     <w:p>
       <w:pPr>
         <w:pStyle w:val="Heading3"/>
@@ -1875,8 +1962,8 @@
         <w:t xml:space="preserve">: demande d’achat → bon de commande (validé par une seconde personne) → réception (entrée en stock) → facture fournisseur.</w:t>
       </w:r>
     </w:p>
-    <w:bookmarkEnd w:id="38"/>
-    <w:bookmarkStart w:id="39" w:name="c.3-stocks"/>
+    <w:bookmarkEnd w:id="39"/>
+    <w:bookmarkStart w:id="40" w:name="c.3-stocks"/>
     <w:p>
       <w:pPr>
         <w:pStyle w:val="Heading3"/>
@@ -1909,8 +1996,8 @@
         <w:t xml:space="preserve">: articles, entrepôts, mouvements, inventaire permanent valorisé au CMUP ou en premier entré-premier sorti, inventaires physiques et écarts, dépréciations.</w:t>
       </w:r>
     </w:p>
-    <w:bookmarkEnd w:id="39"/>
-    <w:bookmarkStart w:id="40" w:name="c.4-production"/>
+    <w:bookmarkEnd w:id="40"/>
+    <w:bookmarkStart w:id="41" w:name="c.4-production"/>
     <w:p>
       <w:pPr>
         <w:pStyle w:val="Heading3"/>
@@ -1943,8 +2030,8 @@
         <w:t xml:space="preserve">: nomenclatures (composants et quantités), ordres de fabrication, consommations, produits finis ; coût de revient incluant les frais d’atelier au coût de l’unité d’œuvre de la comptabilité analytique.</w:t>
       </w:r>
     </w:p>
-    <w:bookmarkEnd w:id="40"/>
-    <w:bookmarkStart w:id="41" w:name="c.5-crm-et-campagnes"/>
+    <w:bookmarkEnd w:id="41"/>
+    <w:bookmarkStart w:id="42" w:name="c.5-crm-et-campagnes"/>
     <w:p>
       <w:pPr>
         <w:pStyle w:val="Heading3"/>
@@ -1984,9 +2071,9 @@
         </w:pict>
       </w:r>
     </w:p>
-    <w:bookmarkEnd w:id="41"/>
     <w:bookmarkEnd w:id="42"/>
-    <w:bookmarkStart w:id="47" w:name="partie-d-trésorerie-fiscalité-paie-et-rh"/>
+    <w:bookmarkEnd w:id="43"/>
+    <w:bookmarkStart w:id="48" w:name="partie-d-trésorerie-fiscalité-paie-et-rh"/>
     <w:p>
       <w:pPr>
         <w:pStyle w:val="Heading2"/>
@@ -1995,7 +2082,7 @@
         <w:t xml:space="preserve">Partie D — Trésorerie, fiscalité, paie et RH</w:t>
       </w:r>
     </w:p>
-    <w:bookmarkStart w:id="43" w:name="d.1-trésorerie-et-devises"/>
+    <w:bookmarkStart w:id="44" w:name="d.1-trésorerie-et-devises"/>
     <w:p>
       <w:pPr>
         <w:pStyle w:val="Heading3"/>
@@ -2044,8 +2131,8 @@
         <w:t xml:space="preserve">: prévision à 13 semaines et mensuelle, alimentée par les échéances clients et fournisseurs, la paie et les impôts.</w:t>
       </w:r>
     </w:p>
-    <w:bookmarkEnd w:id="43"/>
-    <w:bookmarkStart w:id="44" w:name="d.2-fiscalité"/>
+    <w:bookmarkEnd w:id="44"/>
+    <w:bookmarkStart w:id="45" w:name="d.2-fiscalité"/>
     <w:p>
       <w:pPr>
         <w:pStyle w:val="Heading3"/>
@@ -2182,8 +2269,8 @@
         <w:t xml:space="preserve">du pays, avec leur version et leur statut (« à valider » tant qu’un fiscaliste ne les a pas relues).</w:t>
       </w:r>
     </w:p>
-    <w:bookmarkEnd w:id="44"/>
-    <w:bookmarkStart w:id="45" w:name="d.3-paie"/>
+    <w:bookmarkEnd w:id="45"/>
+    <w:bookmarkStart w:id="46" w:name="d.3-paie"/>
     <w:p>
       <w:pPr>
         <w:pStyle w:val="Heading3"/>
@@ -2277,8 +2364,8 @@
         <w:t xml:space="preserve">.</w:t>
       </w:r>
     </w:p>
-    <w:bookmarkEnd w:id="45"/>
-    <w:bookmarkStart w:id="46" w:name="d.4-ressources-humaines"/>
+    <w:bookmarkEnd w:id="46"/>
+    <w:bookmarkStart w:id="47" w:name="d.4-ressources-humaines"/>
     <w:p>
       <w:pPr>
         <w:pStyle w:val="Heading3"/>
@@ -2318,9 +2405,9 @@
         </w:pict>
       </w:r>
     </w:p>
-    <w:bookmarkEnd w:id="46"/>
     <w:bookmarkEnd w:id="47"/>
-    <w:bookmarkStart w:id="52" w:name="partie-e-pilotage"/>
+    <w:bookmarkEnd w:id="48"/>
+    <w:bookmarkStart w:id="53" w:name="partie-e-pilotage"/>
     <w:p>
       <w:pPr>
         <w:pStyle w:val="Heading2"/>
@@ -2329,7 +2416,7 @@
         <w:t xml:space="preserve">Partie E — Pilotage</w:t>
       </w:r>
     </w:p>
-    <w:bookmarkStart w:id="48" w:name="e.1-budget"/>
+    <w:bookmarkStart w:id="49" w:name="e.1-budget"/>
     <w:p>
       <w:pPr>
         <w:pStyle w:val="Heading3"/>
@@ -2362,8 +2449,8 @@
         <w:t xml:space="preserve">: saisie du budget par compte et par période, suivi des réalisations, alerte ou blocage d’une dépense qui dépasse le budget.</w:t>
       </w:r>
     </w:p>
-    <w:bookmarkEnd w:id="48"/>
-    <w:bookmarkStart w:id="49" w:name="e.2-comptabilité-analytique"/>
+    <w:bookmarkEnd w:id="49"/>
+    <w:bookmarkStart w:id="50" w:name="e.2-comptabilité-analytique"/>
     <w:p>
       <w:pPr>
         <w:pStyle w:val="Heading3"/>
@@ -2535,8 +2622,8 @@
         <w:t xml:space="preserve">Le chef comptable valide la période analytique.</w:t>
       </w:r>
     </w:p>
-    <w:bookmarkEnd w:id="49"/>
-    <w:bookmarkStart w:id="50" w:name="e.3-consolidation"/>
+    <w:bookmarkEnd w:id="50"/>
+    <w:bookmarkStart w:id="51" w:name="e.3-consolidation"/>
     <w:p>
       <w:pPr>
         <w:pStyle w:val="Heading3"/>
@@ -2680,8 +2767,8 @@
         <w:t xml:space="preserve">.</w:t>
       </w:r>
     </w:p>
-    <w:bookmarkEnd w:id="50"/>
-    <w:bookmarkStart w:id="51" w:name="e.4-projets-dinvestissement"/>
+    <w:bookmarkEnd w:id="51"/>
+    <w:bookmarkStart w:id="52" w:name="e.4-projets-dinvestissement"/>
     <w:p>
       <w:pPr>
         <w:pStyle w:val="Heading3"/>
@@ -2721,9 +2808,9 @@
         </w:pict>
       </w:r>
     </w:p>
-    <w:bookmarkEnd w:id="51"/>
     <w:bookmarkEnd w:id="52"/>
-    <w:bookmarkStart w:id="53" w:name="partie-f-jupser-ia"/>
+    <w:bookmarkEnd w:id="53"/>
+    <w:bookmarkStart w:id="54" w:name="partie-f-jupser-ia"/>
     <w:p>
       <w:pPr>
         <w:pStyle w:val="Heading2"/>
@@ -2855,8 +2942,8 @@
         </w:pict>
       </w:r>
     </w:p>
-    <w:bookmarkEnd w:id="53"/>
-    <w:bookmarkStart w:id="54" w:name="partie-g-cabinets-dexpertise-comptable"/>
+    <w:bookmarkEnd w:id="54"/>
+    <w:bookmarkStart w:id="55" w:name="partie-g-cabinets-dexpertise-comptable"/>
     <w:p>
       <w:pPr>
         <w:pStyle w:val="Heading2"/>
@@ -2982,8 +3069,8 @@
         </w:pict>
       </w:r>
     </w:p>
-    <w:bookmarkEnd w:id="54"/>
-    <w:bookmarkStart w:id="55" w:name="X2c591612e8eac2d3aa7aade5883675066a9ca73"/>
+    <w:bookmarkEnd w:id="55"/>
+    <w:bookmarkStart w:id="56" w:name="X2c591612e8eac2d3aa7aade5883675066a9ca73"/>
     <w:p>
       <w:pPr>
         <w:pStyle w:val="Heading2"/>
@@ -3103,8 +3190,8 @@
         </w:pict>
       </w:r>
     </w:p>
-    <w:bookmarkEnd w:id="55"/>
-    <w:bookmarkStart w:id="56" w:name="Xa494901d11ad47dfcdd7b518339ca2d1c103d4a"/>
+    <w:bookmarkEnd w:id="56"/>
+    <w:bookmarkStart w:id="57" w:name="Xa494901d11ad47dfcdd7b518339ca2d1c103d4a"/>
     <w:p>
       <w:pPr>
         <w:pStyle w:val="Heading2"/>
@@ -3385,8 +3472,8 @@
         </w:tc>
       </w:tr>
     </w:tbl>
-    <w:bookmarkEnd w:id="56"/>
-    <w:bookmarkStart w:id="57" w:name="partie-j-bonnes-pratiques"/>
+    <w:bookmarkEnd w:id="57"/>
+    <w:bookmarkStart w:id="58" w:name="partie-j-bonnes-pratiques"/>
     <w:p>
       <w:pPr>
         <w:pStyle w:val="Heading2"/>
@@ -3467,8 +3554,8 @@
         <w:t xml:space="preserve">Faire relire par un expert-comptable les opérations complexes (opérations spécifiques, consolidation) avant validation.</w:t>
       </w:r>
     </w:p>
-    <w:bookmarkEnd w:id="57"/>
     <w:bookmarkEnd w:id="58"/>
+    <w:bookmarkEnd w:id="59"/>
     <w:sectPr/>
   </w:body>
 </w:document>

</xml_diff>

<commit_message>
feat(groupe): factures intragroupe avec circuit d'acceptation (liaison des sociétés, boîte de réception, acceptation avec entrée en stock, refus motivé, annulation par avoir) et retraitement automatique de la marge interne non réalisée en consolidation
Co-Authored-By: Claude Opus 5.5 <noreply@anthropic.com>
Claude-Session: https://claude.ai/code/session_01PES9v2QUtNkt2rhV2e9a8j
</commit_message>
<xml_diff>
--- a/docs/manuels/word/02_MANUEL_D_UTILISATION.docx
+++ b/docs/manuels/word/02_MANUEL_D_UTILISATION.docx
@@ -1698,6 +1698,179 @@
         <w:t xml:space="preserve"> </w:t>
       </w:r>
       <w:r>
+        <w:rPr>
+          <w:bCs/>
+          <w:b/>
+        </w:rPr>
+        <w:t xml:space="preserve">Factures entre sociétés du groupe</w:t>
+      </w:r>
+      <w:r>
+        <w:t xml:space="preserve"> </w:t>
+      </w:r>
+      <w:r>
+        <w:t xml:space="preserve">— menu</w:t>
+      </w:r>
+      <w:r>
+        <w:t xml:space="preserve"> </w:t>
+      </w:r>
+      <w:r>
+        <w:rPr>
+          <w:bCs/>
+          <w:b/>
+        </w:rPr>
+        <w:t xml:space="preserve">Intragroupe</w:t>
+      </w:r>
+      <w:r>
+        <w:t xml:space="preserve"> </w:t>
+      </w:r>
+      <w:r>
+        <w:t xml:space="preserve">:</w:t>
+      </w:r>
+      <w:r>
+        <w:t xml:space="preserve"> </w:t>
+      </w:r>
+      <w:r>
+        <w:t xml:space="preserve">1.</w:t>
+      </w:r>
+      <w:r>
+        <w:t xml:space="preserve"> </w:t>
+      </w:r>
+      <w:r>
+        <w:rPr>
+          <w:bCs/>
+          <w:b/>
+        </w:rPr>
+        <w:t xml:space="preserve">Relier</w:t>
+      </w:r>
+      <w:r>
+        <w:t xml:space="preserve"> </w:t>
+      </w:r>
+      <w:r>
+        <w:t xml:space="preserve">une fois les deux sociétés : chacune devient client (4112) et fournisseur (4012) de l’autre.</w:t>
+      </w:r>
+      <w:r>
+        <w:t xml:space="preserve"> </w:t>
+      </w:r>
+      <w:r>
+        <w:t xml:space="preserve">2. La société qui vend émet sa facture normalement (menu</w:t>
+      </w:r>
+      <w:r>
+        <w:t xml:space="preserve"> </w:t>
+      </w:r>
+      <w:r>
+        <w:rPr>
+          <w:bCs/>
+          <w:b/>
+        </w:rPr>
+        <w:t xml:space="preserve">Factures</w:t>
+      </w:r>
+      <w:r>
+        <w:t xml:space="preserve">) au client « … (groupe) ».</w:t>
+      </w:r>
+      <w:r>
+        <w:t xml:space="preserve"> </w:t>
+      </w:r>
+      <w:r>
+        <w:t xml:space="preserve">3. La société destinataire la trouve dans</w:t>
+      </w:r>
+      <w:r>
+        <w:t xml:space="preserve"> </w:t>
+      </w:r>
+      <w:r>
+        <w:rPr>
+          <w:bCs/>
+          <w:b/>
+        </w:rPr>
+        <w:t xml:space="preserve">Factures reçues des sociétés du groupe</w:t>
+      </w:r>
+      <w:r>
+        <w:t xml:space="preserve"> </w:t>
+      </w:r>
+      <w:r>
+        <w:t xml:space="preserve">→</w:t>
+      </w:r>
+      <w:r>
+        <w:t xml:space="preserve"> </w:t>
+      </w:r>
+      <w:r>
+        <w:rPr>
+          <w:bCs/>
+          <w:b/>
+        </w:rPr>
+        <w:t xml:space="preserve">Traiter</w:t>
+      </w:r>
+      <w:r>
+        <w:t xml:space="preserve"> </w:t>
+      </w:r>
+      <w:r>
+        <w:t xml:space="preserve">: pour chaque ligne, compte de charge, de stock ou d’immobilisation, article et dépôt pour une entrée en stock →</w:t>
+      </w:r>
+      <w:r>
+        <w:t xml:space="preserve"> </w:t>
+      </w:r>
+      <w:r>
+        <w:rPr>
+          <w:bCs/>
+          <w:b/>
+        </w:rPr>
+        <w:t xml:space="preserve">Accepter</w:t>
+      </w:r>
+      <w:r>
+        <w:t xml:space="preserve"> </w:t>
+      </w:r>
+      <w:r>
+        <w:t xml:space="preserve">(écriture d’achat en brouillon au journal ACH, à valider) ou</w:t>
+      </w:r>
+      <w:r>
+        <w:t xml:space="preserve"> </w:t>
+      </w:r>
+      <w:r>
+        <w:rPr>
+          <w:bCs/>
+          <w:b/>
+        </w:rPr>
+        <w:t xml:space="preserve">Refuser</w:t>
+      </w:r>
+      <w:r>
+        <w:t xml:space="preserve"> </w:t>
+      </w:r>
+      <w:r>
+        <w:t xml:space="preserve">avec un motif.</w:t>
+      </w:r>
+      <w:r>
+        <w:t xml:space="preserve"> </w:t>
+      </w:r>
+      <w:r>
+        <w:t xml:space="preserve">4. En cas de refus, l’émetteur voit le motif dans</w:t>
+      </w:r>
+      <w:r>
+        <w:t xml:space="preserve"> </w:t>
+      </w:r>
+      <w:r>
+        <w:rPr>
+          <w:bCs/>
+          <w:b/>
+        </w:rPr>
+        <w:t xml:space="preserve">Factures émises</w:t>
+      </w:r>
+      <w:r>
+        <w:t xml:space="preserve"> </w:t>
+      </w:r>
+      <w:r>
+        <w:t xml:space="preserve">et annule par un avoir.</w:t>
+      </w:r>
+      <w:r>
+        <w:t xml:space="preserve"> </w:t>
+      </w:r>
+      <w:r>
+        <w:t xml:space="preserve">5. En consolidation, le chiffre d’affaires intragroupe et la marge restant en stock chez l’acheteur sont éliminés automatiquement.</w:t>
+      </w:r>
+    </w:p>
+    <w:p>
+      <w:pPr>
+        <w:pStyle w:val="BodyText"/>
+      </w:pPr>
+      <w:r>
         <w:t xml:space="preserve">Pour une opération spécifique qui concerne deux sociétés (succursale, société en participation, fusion…), choisissez la société liée dans « Écritures de l’autre partie dans » avant de créer les brouillons.</w:t>
       </w:r>
     </w:p>

</xml_diff>

<commit_message>
feat(groupe): marge intragroupe du stock d'ouverture (réserves puis reprise en résultat) et des immobilisations (élimination, amortissements repris), coût de revient interne des cessions hors stock, durée d'utilité exigée à l'acceptation
Co-Authored-By: Claude Opus 5.5 <noreply@anthropic.com>
Claude-Session: https://claude.ai/code/session_01PES9v2QUtNkt2rhV2e9a8j
</commit_message>
<xml_diff>
--- a/docs/manuels/word/02_MANUEL_D_UTILISATION.docx
+++ b/docs/manuels/word/02_MANUEL_D_UTILISATION.docx
@@ -1863,7 +1863,13 @@
         <w:t xml:space="preserve"> </w:t>
       </w:r>
       <w:r>
-        <w:t xml:space="preserve">5. En consolidation, le chiffre d’affaires intragroupe et la marge restant en stock chez l’acheteur sont éliminés automatiquement.</w:t>
+        <w:t xml:space="preserve">5. Une ligne acceptée en immobilisation (compte 2…) exige la durée d’utilité. Pour céder une immobilisation d’occasion, l’émetteur saisit sur la facture le « coût de revient (groupe) » (valeur nette comptable), qui n’est pas imprimé.</w:t>
+      </w:r>
+      <w:r>
+        <w:t xml:space="preserve"> </w:t>
+      </w:r>
+      <w:r>
+        <w:t xml:space="preserve">6. En consolidation, sont éliminés automatiquement : le chiffre d’affaires intragroupe, la marge restant en stock (ouverture contre les réserves, clôture contre le résultat), la marge sur immobilisations et l’excédent d’amortissement correspondant.</w:t>
       </w:r>
     </w:p>
     <w:p>

</xml_diff>

<commit_message>
feat(commercial): inscription en libre-service à l'essai gratuit de 30 jours (API protégée, page web, lien depuis la connexion), documentation
Co-Authored-By: Claude Opus 5.5 <noreply@anthropic.com>
Claude-Session: https://claude.ai/code/session_01PES9v2QUtNkt2rhV2e9a8j
</commit_message>
<xml_diff>
--- a/docs/manuels/word/02_MANUEL_D_UTILISATION.docx
+++ b/docs/manuels/word/02_MANUEL_D_UTILISATION.docx
@@ -36,7 +36,7 @@
         </w:p>
       </w:sdtContent>
     </w:sdt>
-    <w:bookmarkStart w:id="59" w:name="jupiter-compta-manuel-dutilisation"/>
+    <w:bookmarkStart w:id="60" w:name="jupiter-compta-manuel-dutilisation"/>
     <w:p>
       <w:pPr>
         <w:pStyle w:val="Heading1"/>
@@ -72,7 +72,7 @@
         </w:pict>
       </w:r>
     </w:p>
-    <w:bookmarkStart w:id="25" w:name="partie-a-prise-en-main"/>
+    <w:bookmarkStart w:id="26" w:name="partie-a-prise-en-main"/>
     <w:p>
       <w:pPr>
         <w:pStyle w:val="Heading2"/>
@@ -81,7 +81,51 @@
         <w:t xml:space="preserve">Partie A — Prise en main</w:t>
       </w:r>
     </w:p>
-    <w:bookmarkStart w:id="20" w:name="a.1-se-connecter"/>
+    <w:bookmarkStart w:id="20" w:name="a.0-créer-un-espace-dessai"/>
+    <w:p>
+      <w:pPr>
+        <w:pStyle w:val="Heading3"/>
+      </w:pPr>
+      <w:r>
+        <w:t xml:space="preserve">A.0 Créer un espace d’essai</w:t>
+      </w:r>
+    </w:p>
+    <w:p>
+      <w:pPr>
+        <w:pStyle w:val="FirstParagraph"/>
+      </w:pPr>
+      <w:r>
+        <w:t xml:space="preserve">Sur la page de connexion, cliquez sur</w:t>
+      </w:r>
+      <w:r>
+        <w:t xml:space="preserve"> </w:t>
+      </w:r>
+      <w:r>
+        <w:rPr>
+          <w:bCs/>
+          <w:b/>
+        </w:rPr>
+        <w:t xml:space="preserve">Essai gratuit de 30 jours</w:t>
+      </w:r>
+      <w:r>
+        <w:t xml:space="preserve"> </w:t>
+      </w:r>
+      <w:r>
+        <w:t xml:space="preserve">: nom de l’entreprise ou du cabinet, édition à essayer, nom, adresse électronique, mot de passe, acceptation des conditions. Vous devenez administrateur de votre espace ; connectez-vous, activez la double authentification, puis créez votre société (</w:t>
+      </w:r>
+      <w:r>
+        <w:rPr>
+          <w:bCs/>
+          <w:b/>
+        </w:rPr>
+        <w:t xml:space="preserve">Sociétés</w:t>
+      </w:r>
+      <w:r>
+        <w:t xml:space="preserve">).</w:t>
+      </w:r>
+    </w:p>
+    <w:bookmarkEnd w:id="20"/>
+    <w:bookmarkStart w:id="21" w:name="a.1-se-connecter"/>
     <w:p>
       <w:pPr>
         <w:pStyle w:val="Heading3"/>
@@ -204,8 +248,8 @@
         <w:t xml:space="preserve">).</w:t>
       </w:r>
     </w:p>
-    <w:bookmarkEnd w:id="20"/>
-    <w:bookmarkStart w:id="21" w:name="a.2-lécran-principal"/>
+    <w:bookmarkEnd w:id="21"/>
+    <w:bookmarkStart w:id="22" w:name="a.2-lécran-principal"/>
     <w:p>
       <w:pPr>
         <w:pStyle w:val="Heading3"/>
@@ -296,8 +340,8 @@
         <w:t xml:space="preserve">: indicateurs de votre périmètre (trésorerie, chiffre d’affaires, échéances, alertes).</w:t>
       </w:r>
     </w:p>
-    <w:bookmarkEnd w:id="21"/>
-    <w:bookmarkStart w:id="22" w:name="a.3-rôles-et-droits"/>
+    <w:bookmarkEnd w:id="22"/>
+    <w:bookmarkStart w:id="23" w:name="a.3-rôles-et-droits"/>
     <w:p>
       <w:pPr>
         <w:pStyle w:val="Heading3"/>
@@ -649,8 +693,8 @@
         </w:tc>
       </w:tr>
     </w:tbl>
-    <w:bookmarkEnd w:id="22"/>
-    <w:bookmarkStart w:id="23" w:name="a.4-créer-une-société-administrateur"/>
+    <w:bookmarkEnd w:id="23"/>
+    <w:bookmarkStart w:id="24" w:name="a.4-créer-une-société-administrateur"/>
     <w:p>
       <w:pPr>
         <w:pStyle w:val="Heading3"/>
@@ -683,8 +727,8 @@
         <w:t xml:space="preserve">: raison sociale, pays (le pack fiscal et social s’en déduit), monnaie de tenue (CDF en RDC, XOF, XAF…), système comptable (normal ou SMT), premier exercice. Le plan de comptes SYSCOHADA à six chiffres est installé automatiquement.</w:t>
       </w:r>
     </w:p>
-    <w:bookmarkEnd w:id="23"/>
-    <w:bookmarkStart w:id="24" w:name="X13febdc7f38c0ad6495eb15cb4e4ea2febd104c"/>
+    <w:bookmarkEnd w:id="24"/>
+    <w:bookmarkStart w:id="25" w:name="X13febdc7f38c0ad6495eb15cb4e4ea2febd104c"/>
     <w:p>
       <w:pPr>
         <w:pStyle w:val="Heading3"/>
@@ -753,9 +797,9 @@
         </w:pict>
       </w:r>
     </w:p>
-    <w:bookmarkEnd w:id="24"/>
     <w:bookmarkEnd w:id="25"/>
-    <w:bookmarkStart w:id="37" w:name="partie-b-comptabilité-générale"/>
+    <w:bookmarkEnd w:id="26"/>
+    <w:bookmarkStart w:id="38" w:name="partie-b-comptabilité-générale"/>
     <w:p>
       <w:pPr>
         <w:pStyle w:val="Heading2"/>
@@ -764,7 +808,7 @@
         <w:t xml:space="preserve">Partie B — Comptabilité générale</w:t>
       </w:r>
     </w:p>
-    <w:bookmarkStart w:id="26" w:name="b.1-le-plan-comptable"/>
+    <w:bookmarkStart w:id="27" w:name="b.1-le-plan-comptable"/>
     <w:p>
       <w:pPr>
         <w:pStyle w:val="Heading3"/>
@@ -797,8 +841,8 @@
         <w:t xml:space="preserve">: consultation, recherche, création de sous-comptes. Les comptes de regroupement (en gras, non imputables) ne reçoivent pas d’écritures : utilisez leurs sous-comptes (par exemple 521100 et non 521000).</w:t>
       </w:r>
     </w:p>
-    <w:bookmarkEnd w:id="26"/>
-    <w:bookmarkStart w:id="27" w:name="b.2-les-tiers"/>
+    <w:bookmarkEnd w:id="27"/>
+    <w:bookmarkStart w:id="28" w:name="b.2-les-tiers"/>
     <w:p>
       <w:pPr>
         <w:pStyle w:val="Heading3"/>
@@ -831,8 +875,8 @@
         <w:t xml:space="preserve">: clients, fournisseurs, salariés, État, associés. Chaque tiers est rattaché à un compte collectif (411, 401…). Le tiers est obligatoire lorsque vous mouvementez un compte collectif.</w:t>
       </w:r>
     </w:p>
-    <w:bookmarkEnd w:id="27"/>
-    <w:bookmarkStart w:id="28" w:name="b.3-saisir-une-écriture"/>
+    <w:bookmarkEnd w:id="28"/>
+    <w:bookmarkStart w:id="29" w:name="b.3-saisir-une-écriture"/>
     <w:p>
       <w:pPr>
         <w:pStyle w:val="Heading3"/>
@@ -1011,8 +1055,8 @@
         <w:t xml:space="preserve">Contrôles automatiques : écriture équilibrée, date dans un exercice ouvert et une période non verrouillée, comptes imputables.</w:t>
       </w:r>
     </w:p>
-    <w:bookmarkEnd w:id="28"/>
-    <w:bookmarkStart w:id="29" w:name="b.4-consulter-valider-contre-passer"/>
+    <w:bookmarkEnd w:id="29"/>
+    <w:bookmarkStart w:id="30" w:name="b.4-consulter-valider-contre-passer"/>
     <w:p>
       <w:pPr>
         <w:pStyle w:val="Heading3"/>
@@ -1111,8 +1155,8 @@
         <w:t xml:space="preserve">une écriture validée : une écriture inverse est créée (on ne modifie jamais une écriture validée).</w:t>
       </w:r>
     </w:p>
-    <w:bookmarkEnd w:id="29"/>
-    <w:bookmarkStart w:id="30" w:name="b.5-livres-et-états"/>
+    <w:bookmarkEnd w:id="30"/>
+    <w:bookmarkStart w:id="31" w:name="b.5-livres-et-états"/>
     <w:p>
       <w:pPr>
         <w:pStyle w:val="Heading3"/>
@@ -1246,8 +1290,8 @@
         <w:t xml:space="preserve">: pour les entités du système minimal de trésorerie.</w:t>
       </w:r>
     </w:p>
-    <w:bookmarkEnd w:id="30"/>
-    <w:bookmarkStart w:id="31" w:name="b.6-immobilisations"/>
+    <w:bookmarkEnd w:id="31"/>
+    <w:bookmarkStart w:id="32" w:name="b.6-immobilisations"/>
     <w:p>
       <w:pPr>
         <w:pStyle w:val="Heading3"/>
@@ -1344,8 +1388,8 @@
         <w:t xml:space="preserve">crée l’écriture de dotation en brouillon. Les tests de dépréciation, le renouvellement d’un composant et les cessions se font depuis la fiche.</w:t>
       </w:r>
     </w:p>
-    <w:bookmarkEnd w:id="31"/>
-    <w:bookmarkStart w:id="32" w:name="b.7-rapprochement-bancaire"/>
+    <w:bookmarkEnd w:id="32"/>
+    <w:bookmarkStart w:id="33" w:name="b.7-rapprochement-bancaire"/>
     <w:p>
       <w:pPr>
         <w:pStyle w:val="Heading3"/>
@@ -1378,8 +1422,8 @@
         <w:t xml:space="preserve">: importez le relevé de la banque ; le logiciel propose des correspondances entre les lignes du relevé et les écritures du compte 52. Acceptez les correspondances, traitez les suspens, éditez l’état de rapprochement.</w:t>
       </w:r>
     </w:p>
-    <w:bookmarkEnd w:id="32"/>
-    <w:bookmarkStart w:id="33" w:name="b.8-imports"/>
+    <w:bookmarkEnd w:id="33"/>
+    <w:bookmarkStart w:id="34" w:name="b.8-imports"/>
     <w:p>
       <w:pPr>
         <w:pStyle w:val="Heading3"/>
@@ -1484,8 +1528,8 @@
         <w:t xml:space="preserve">Le logiciel propose une correspondance des comptes et la mémorise.</w:t>
       </w:r>
     </w:p>
-    <w:bookmarkEnd w:id="33"/>
-    <w:bookmarkStart w:id="34" w:name="b.9-opérations-spécifiques"/>
+    <w:bookmarkEnd w:id="34"/>
+    <w:bookmarkStart w:id="35" w:name="b.9-opérations-spécifiques"/>
     <w:p>
       <w:pPr>
         <w:pStyle w:val="Heading3"/>
@@ -1614,8 +1658,8 @@
         <w:t xml:space="preserve">Exemples : location-acquisition, cession de titres, constitution de société, subvention d’investissement, emprunt obligataire, engagements de retraite, position de change, contrat pluri-exercices, réévaluation, fusion, liquidation.</w:t>
       </w:r>
     </w:p>
-    <w:bookmarkEnd w:id="34"/>
-    <w:bookmarkStart w:id="35" w:name="X793f75de194c6f323b3d2d5700384e3ea4358c0"/>
+    <w:bookmarkEnd w:id="35"/>
+    <w:bookmarkStart w:id="36" w:name="X793f75de194c6f323b3d2d5700384e3ea4358c0"/>
     <w:p>
       <w:pPr>
         <w:pStyle w:val="Heading3"/>
@@ -1880,8 +1924,8 @@
         <w:t xml:space="preserve">Pour une opération spécifique qui concerne deux sociétés (succursale, société en participation, fusion…), choisissez la société liée dans « Écritures de l’autre partie dans » avant de créer les brouillons.</w:t>
       </w:r>
     </w:p>
-    <w:bookmarkEnd w:id="35"/>
-    <w:bookmarkStart w:id="36" w:name="b.10-clôture-de-lexercice"/>
+    <w:bookmarkEnd w:id="36"/>
+    <w:bookmarkStart w:id="37" w:name="b.10-clôture-de-lexercice"/>
     <w:p>
       <w:pPr>
         <w:pStyle w:val="Heading3"/>
@@ -2002,9 +2046,9 @@
         </w:pict>
       </w:r>
     </w:p>
-    <w:bookmarkEnd w:id="36"/>
     <w:bookmarkEnd w:id="37"/>
-    <w:bookmarkStart w:id="43" w:name="Xb19f9442ab7d684838861f4ae9173b709e3a294"/>
+    <w:bookmarkEnd w:id="38"/>
+    <w:bookmarkStart w:id="44" w:name="Xb19f9442ab7d684838861f4ae9173b709e3a294"/>
     <w:p>
       <w:pPr>
         <w:pStyle w:val="Heading2"/>
@@ -2013,7 +2057,7 @@
         <w:t xml:space="preserve">Partie C — Gestion commerciale, stocks et production</w:t>
       </w:r>
     </w:p>
-    <w:bookmarkStart w:id="38" w:name="c.1-factures-et-documents-commerciaux"/>
+    <w:bookmarkStart w:id="39" w:name="c.1-factures-et-documents-commerciaux"/>
     <w:p>
       <w:pPr>
         <w:pStyle w:val="Heading3"/>
@@ -2107,8 +2151,8 @@
         <w:t xml:space="preserve">de la DGI. L’écriture de vente, la créance client, la TVA collectée et la sortie de stock sont générées automatiquement. Même logique pour les devis, proformas, bons de commande et bons de livraison.</w:t>
       </w:r>
     </w:p>
-    <w:bookmarkEnd w:id="38"/>
-    <w:bookmarkStart w:id="39" w:name="c.2-achats"/>
+    <w:bookmarkEnd w:id="39"/>
+    <w:bookmarkStart w:id="40" w:name="c.2-achats"/>
     <w:p>
       <w:pPr>
         <w:pStyle w:val="Heading3"/>
@@ -2141,8 +2185,8 @@
         <w:t xml:space="preserve">: demande d’achat → bon de commande (validé par une seconde personne) → réception (entrée en stock) → facture fournisseur.</w:t>
       </w:r>
     </w:p>
-    <w:bookmarkEnd w:id="39"/>
-    <w:bookmarkStart w:id="40" w:name="c.3-stocks"/>
+    <w:bookmarkEnd w:id="40"/>
+    <w:bookmarkStart w:id="41" w:name="c.3-stocks"/>
     <w:p>
       <w:pPr>
         <w:pStyle w:val="Heading3"/>
@@ -2175,8 +2219,8 @@
         <w:t xml:space="preserve">: articles, entrepôts, mouvements, inventaire permanent valorisé au CMUP ou en premier entré-premier sorti, inventaires physiques et écarts, dépréciations.</w:t>
       </w:r>
     </w:p>
-    <w:bookmarkEnd w:id="40"/>
-    <w:bookmarkStart w:id="41" w:name="c.4-production"/>
+    <w:bookmarkEnd w:id="41"/>
+    <w:bookmarkStart w:id="42" w:name="c.4-production"/>
     <w:p>
       <w:pPr>
         <w:pStyle w:val="Heading3"/>
@@ -2209,8 +2253,8 @@
         <w:t xml:space="preserve">: nomenclatures (composants et quantités), ordres de fabrication, consommations, produits finis ; coût de revient incluant les frais d’atelier au coût de l’unité d’œuvre de la comptabilité analytique.</w:t>
       </w:r>
     </w:p>
-    <w:bookmarkEnd w:id="41"/>
-    <w:bookmarkStart w:id="42" w:name="c.5-crm-et-campagnes"/>
+    <w:bookmarkEnd w:id="42"/>
+    <w:bookmarkStart w:id="43" w:name="c.5-crm-et-campagnes"/>
     <w:p>
       <w:pPr>
         <w:pStyle w:val="Heading3"/>
@@ -2250,9 +2294,9 @@
         </w:pict>
       </w:r>
     </w:p>
-    <w:bookmarkEnd w:id="42"/>
     <w:bookmarkEnd w:id="43"/>
-    <w:bookmarkStart w:id="48" w:name="partie-d-trésorerie-fiscalité-paie-et-rh"/>
+    <w:bookmarkEnd w:id="44"/>
+    <w:bookmarkStart w:id="49" w:name="partie-d-trésorerie-fiscalité-paie-et-rh"/>
     <w:p>
       <w:pPr>
         <w:pStyle w:val="Heading2"/>
@@ -2261,7 +2305,7 @@
         <w:t xml:space="preserve">Partie D — Trésorerie, fiscalité, paie et RH</w:t>
       </w:r>
     </w:p>
-    <w:bookmarkStart w:id="44" w:name="d.1-trésorerie-et-devises"/>
+    <w:bookmarkStart w:id="45" w:name="d.1-trésorerie-et-devises"/>
     <w:p>
       <w:pPr>
         <w:pStyle w:val="Heading3"/>
@@ -2310,8 +2354,8 @@
         <w:t xml:space="preserve">: prévision à 13 semaines et mensuelle, alimentée par les échéances clients et fournisseurs, la paie et les impôts.</w:t>
       </w:r>
     </w:p>
-    <w:bookmarkEnd w:id="44"/>
-    <w:bookmarkStart w:id="45" w:name="d.2-fiscalité"/>
+    <w:bookmarkEnd w:id="45"/>
+    <w:bookmarkStart w:id="46" w:name="d.2-fiscalité"/>
     <w:p>
       <w:pPr>
         <w:pStyle w:val="Heading3"/>
@@ -2448,8 +2492,8 @@
         <w:t xml:space="preserve">du pays, avec leur version et leur statut (« à valider » tant qu’un fiscaliste ne les a pas relues).</w:t>
       </w:r>
     </w:p>
-    <w:bookmarkEnd w:id="45"/>
-    <w:bookmarkStart w:id="46" w:name="d.3-paie"/>
+    <w:bookmarkEnd w:id="46"/>
+    <w:bookmarkStart w:id="47" w:name="d.3-paie"/>
     <w:p>
       <w:pPr>
         <w:pStyle w:val="Heading3"/>
@@ -2543,8 +2587,8 @@
         <w:t xml:space="preserve">.</w:t>
       </w:r>
     </w:p>
-    <w:bookmarkEnd w:id="46"/>
-    <w:bookmarkStart w:id="47" w:name="d.4-ressources-humaines"/>
+    <w:bookmarkEnd w:id="47"/>
+    <w:bookmarkStart w:id="48" w:name="d.4-ressources-humaines"/>
     <w:p>
       <w:pPr>
         <w:pStyle w:val="Heading3"/>
@@ -2584,9 +2628,9 @@
         </w:pict>
       </w:r>
     </w:p>
-    <w:bookmarkEnd w:id="47"/>
     <w:bookmarkEnd w:id="48"/>
-    <w:bookmarkStart w:id="53" w:name="partie-e-pilotage"/>
+    <w:bookmarkEnd w:id="49"/>
+    <w:bookmarkStart w:id="54" w:name="partie-e-pilotage"/>
     <w:p>
       <w:pPr>
         <w:pStyle w:val="Heading2"/>
@@ -2595,7 +2639,7 @@
         <w:t xml:space="preserve">Partie E — Pilotage</w:t>
       </w:r>
     </w:p>
-    <w:bookmarkStart w:id="49" w:name="e.1-budget"/>
+    <w:bookmarkStart w:id="50" w:name="e.1-budget"/>
     <w:p>
       <w:pPr>
         <w:pStyle w:val="Heading3"/>
@@ -2628,8 +2672,8 @@
         <w:t xml:space="preserve">: saisie du budget par compte et par période, suivi des réalisations, alerte ou blocage d’une dépense qui dépasse le budget.</w:t>
       </w:r>
     </w:p>
-    <w:bookmarkEnd w:id="49"/>
-    <w:bookmarkStart w:id="50" w:name="e.2-comptabilité-analytique"/>
+    <w:bookmarkEnd w:id="50"/>
+    <w:bookmarkStart w:id="51" w:name="e.2-comptabilité-analytique"/>
     <w:p>
       <w:pPr>
         <w:pStyle w:val="Heading3"/>
@@ -2801,8 +2845,8 @@
         <w:t xml:space="preserve">Le chef comptable valide la période analytique.</w:t>
       </w:r>
     </w:p>
-    <w:bookmarkEnd w:id="50"/>
-    <w:bookmarkStart w:id="51" w:name="e.3-consolidation"/>
+    <w:bookmarkEnd w:id="51"/>
+    <w:bookmarkStart w:id="52" w:name="e.3-consolidation"/>
     <w:p>
       <w:pPr>
         <w:pStyle w:val="Heading3"/>
@@ -2946,8 +2990,8 @@
         <w:t xml:space="preserve">.</w:t>
       </w:r>
     </w:p>
-    <w:bookmarkEnd w:id="51"/>
-    <w:bookmarkStart w:id="52" w:name="e.4-projets-dinvestissement"/>
+    <w:bookmarkEnd w:id="52"/>
+    <w:bookmarkStart w:id="53" w:name="e.4-projets-dinvestissement"/>
     <w:p>
       <w:pPr>
         <w:pStyle w:val="Heading3"/>
@@ -2987,9 +3031,9 @@
         </w:pict>
       </w:r>
     </w:p>
-    <w:bookmarkEnd w:id="52"/>
     <w:bookmarkEnd w:id="53"/>
-    <w:bookmarkStart w:id="54" w:name="partie-f-jupser-ia"/>
+    <w:bookmarkEnd w:id="54"/>
+    <w:bookmarkStart w:id="55" w:name="partie-f-jupser-ia"/>
     <w:p>
       <w:pPr>
         <w:pStyle w:val="Heading2"/>
@@ -3121,8 +3165,8 @@
         </w:pict>
       </w:r>
     </w:p>
-    <w:bookmarkEnd w:id="54"/>
-    <w:bookmarkStart w:id="55" w:name="partie-g-cabinets-dexpertise-comptable"/>
+    <w:bookmarkEnd w:id="55"/>
+    <w:bookmarkStart w:id="56" w:name="partie-g-cabinets-dexpertise-comptable"/>
     <w:p>
       <w:pPr>
         <w:pStyle w:val="Heading2"/>
@@ -3248,8 +3292,8 @@
         </w:pict>
       </w:r>
     </w:p>
-    <w:bookmarkEnd w:id="55"/>
-    <w:bookmarkStart w:id="56" w:name="X2c591612e8eac2d3aa7aade5883675066a9ca73"/>
+    <w:bookmarkEnd w:id="56"/>
+    <w:bookmarkStart w:id="57" w:name="X2c591612e8eac2d3aa7aade5883675066a9ca73"/>
     <w:p>
       <w:pPr>
         <w:pStyle w:val="Heading2"/>
@@ -3369,8 +3413,8 @@
         </w:pict>
       </w:r>
     </w:p>
-    <w:bookmarkEnd w:id="56"/>
-    <w:bookmarkStart w:id="57" w:name="Xa494901d11ad47dfcdd7b518339ca2d1c103d4a"/>
+    <w:bookmarkEnd w:id="57"/>
+    <w:bookmarkStart w:id="58" w:name="Xa494901d11ad47dfcdd7b518339ca2d1c103d4a"/>
     <w:p>
       <w:pPr>
         <w:pStyle w:val="Heading2"/>
@@ -3651,8 +3695,8 @@
         </w:tc>
       </w:tr>
     </w:tbl>
-    <w:bookmarkEnd w:id="57"/>
-    <w:bookmarkStart w:id="58" w:name="partie-j-bonnes-pratiques"/>
+    <w:bookmarkEnd w:id="58"/>
+    <w:bookmarkStart w:id="59" w:name="partie-j-bonnes-pratiques"/>
     <w:p>
       <w:pPr>
         <w:pStyle w:val="Heading2"/>
@@ -3733,8 +3777,8 @@
         <w:t xml:space="preserve">Faire relire par un expert-comptable les opérations complexes (opérations spécifiques, consolidation) avant validation.</w:t>
       </w:r>
     </w:p>
-    <w:bookmarkEnd w:id="58"/>
     <w:bookmarkEnd w:id="59"/>
+    <w:bookmarkEnd w:id="60"/>
     <w:sectPr/>
   </w:body>
 </w:document>

</xml_diff>